<commit_message>
docs: actualizar el DOC-01 en docs/analisis con el plan Consultorio
</commit_message>
<xml_diff>
--- a/docs/analisis/DOC-01_Formulacion_y_Constitucion.docx
+++ b/docs/analisis/DOC-01_Formulacion_y_Constitucion.docx
@@ -561,7 +561,7 @@
           <w:szCs w:val="24"/>
           <w:rtl w:val="0"/>
         </w:rPr>
-        <w:t xml:space="preserve">7</w:t>
+        <w:t xml:space="preserve">8</w:t>
       </w:r>
       <w:r>
         <w:rPr>
@@ -1756,7 +1756,7 @@
           <w:szCs w:val="24"/>
           <w:rtl w:val="0"/>
         </w:rPr>
-        <w:t xml:space="preserve">18</w:t>
+        <w:t xml:space="preserve">19</w:t>
       </w:r>
       <w:r>
         <w:rPr>
@@ -1819,7 +1819,7 @@
           <w:szCs w:val="24"/>
           <w:rtl w:val="0"/>
         </w:rPr>
-        <w:t xml:space="preserve">19</w:t>
+        <w:t xml:space="preserve">20</w:t>
       </w:r>
       <w:r>
         <w:rPr>
@@ -1882,7 +1882,7 @@
           <w:szCs w:val="24"/>
           <w:rtl w:val="0"/>
         </w:rPr>
-        <w:t xml:space="preserve">19</w:t>
+        <w:t xml:space="preserve">20</w:t>
       </w:r>
       <w:r>
         <w:rPr>
@@ -1945,7 +1945,7 @@
           <w:szCs w:val="24"/>
           <w:rtl w:val="0"/>
         </w:rPr>
-        <w:t xml:space="preserve">21</w:t>
+        <w:t xml:space="preserve">22</w:t>
       </w:r>
       <w:r>
         <w:rPr>
@@ -2008,7 +2008,7 @@
           <w:szCs w:val="24"/>
           <w:rtl w:val="0"/>
         </w:rPr>
-        <w:t xml:space="preserve">21</w:t>
+        <w:t xml:space="preserve">22</w:t>
       </w:r>
       <w:r>
         <w:rPr>
@@ -2071,7 +2071,7 @@
           <w:szCs w:val="24"/>
           <w:rtl w:val="0"/>
         </w:rPr>
-        <w:t xml:space="preserve">21</w:t>
+        <w:t xml:space="preserve">22</w:t>
       </w:r>
       <w:r>
         <w:rPr>
@@ -2134,7 +2134,7 @@
           <w:szCs w:val="24"/>
           <w:rtl w:val="0"/>
         </w:rPr>
-        <w:t xml:space="preserve">23</w:t>
+        <w:t xml:space="preserve">24</w:t>
       </w:r>
       <w:r>
         <w:rPr>
@@ -3876,7 +3876,7 @@
                 <w:szCs w:val="22"/>
                 <w:rtl w:val="0"/>
               </w:rPr>
-              <w:t xml:space="preserve">Incorporación del modelo de adopción del servicio (Sección 7.3): servicio en la nube del proveedor, cliente de descarga gratuita, proceso de adquisición en siete pasos y planes por capacidad (Clínica, Hospital y Red de Salud), consultables en la aplicación antes de iniciar sesión y con solicitud de demostración, cotización o cambio de plan.</w:t>
+              <w:t xml:space="preserve">Incorporación del modelo de adopción del servicio (Sección 7.3): servicio en la nube del proveedor, cliente de descarga gratuita, proceso de adquisición en siete pasos y planes por capacidad (Consultorio, Clínica, Hospital y Red de Salud), consultables en la aplicación antes de iniciar sesión y con solicitud de demostración, cotización o cambio de plan. Ajuste del 26/10/2026: nuevo plan Consultorio para la baja complejidad y mayor almacenamiento en los planes Clínica (25 GB) y Hospital (100 GB).</w:t>
             </w:r>
             <w:r>
               <w:rPr>
@@ -6149,7 +6149,7 @@
                 <w:szCs w:val="22"/>
                 <w:rtl w:val="0"/>
               </w:rPr>
-              <w:t xml:space="preserve">Clínica</w:t>
+              <w:t xml:space="preserve">Consultorio</w:t>
             </w:r>
             <w:r>
               <w:rPr>
@@ -6173,7 +6173,7 @@
                 <w:szCs w:val="22"/>
                 <w:rtl w:val="0"/>
               </w:rPr>
-              <w:t xml:space="preserve">IPS pequeñas y consultorios con área biomédica propia</w:t>
+              <w:t xml:space="preserve">IPS de baja complejidad, consultorios y centros especializados pequeños</w:t>
             </w:r>
             <w:r>
               <w:rPr>
@@ -6197,7 +6197,7 @@
                 <w:szCs w:val="22"/>
                 <w:rtl w:val="0"/>
               </w:rPr>
-              <w:t xml:space="preserve">Hasta 7 usuarios de gestión, 1.000 equipos activos y 10 GB de documentos</w:t>
+              <w:t xml:space="preserve">Hasta 3 usuarios de gestión, 300 equipos activos y 5 GB de documentos</w:t>
             </w:r>
             <w:r>
               <w:rPr>
@@ -6245,7 +6245,7 @@
                 <w:szCs w:val="22"/>
                 <w:rtl w:val="0"/>
               </w:rPr>
-              <w:t xml:space="preserve">$380.000</w:t>
+              <w:t xml:space="preserve">$190.000</w:t>
             </w:r>
             <w:r>
               <w:rPr>
@@ -6275,7 +6275,7 @@
                 <w:szCs w:val="22"/>
                 <w:rtl w:val="0"/>
               </w:rPr>
-              <w:t xml:space="preserve">Hospital</w:t>
+              <w:t xml:space="preserve">Clínica</w:t>
             </w:r>
             <w:r>
               <w:rPr>
@@ -6299,7 +6299,7 @@
                 <w:szCs w:val="22"/>
                 <w:rtl w:val="0"/>
               </w:rPr>
-              <w:t xml:space="preserve">IPS de mediana complejidad</w:t>
+              <w:t xml:space="preserve">Clínicas e IPS pequeñas con área biomédica propia</w:t>
             </w:r>
             <w:r>
               <w:rPr>
@@ -6323,7 +6323,133 @@
                 <w:szCs w:val="22"/>
                 <w:rtl w:val="0"/>
               </w:rPr>
-              <w:t xml:space="preserve">Hasta 14 usuarios de gestión, 3.000 equipos activos y 50 GB de documentos</w:t>
+              <w:t xml:space="preserve">Hasta 7 usuarios de gestión, 1.000 equipos activos y 25 GB de documentos</w:t>
+            </w:r>
+            <w:r>
+              <w:rPr>
+                <w:rtl w:val="0"/>
+              </w:rPr>
+            </w:r>
+          </w:p>
+        </w:tc>
+        <w:tc>
+          <w:tcPr/>
+          <w:p>
+            <w:pPr>
+              <w:spacing w:after="60" w:before="60" w:line="276" w:lineRule="auto"/>
+              <w:ind w:firstLine="0"/>
+              <w:rPr/>
+            </w:pPr>
+            <w:r>
+              <w:rPr>
+                <w:rFonts w:ascii="Times New Roman" w:cs="Times New Roman" w:eastAsia="Times New Roman" w:hAnsi="Times New Roman"/>
+                <w:sz w:val="22"/>
+                <w:szCs w:val="22"/>
+                <w:rtl w:val="0"/>
+              </w:rPr>
+              <w:t xml:space="preserve">En horario hábil</w:t>
+            </w:r>
+            <w:r>
+              <w:rPr>
+                <w:rtl w:val="0"/>
+              </w:rPr>
+            </w:r>
+          </w:p>
+        </w:tc>
+        <w:tc>
+          <w:tcPr/>
+          <w:p>
+            <w:pPr>
+              <w:spacing w:after="60" w:before="60" w:line="276" w:lineRule="auto"/>
+              <w:ind w:firstLine="0"/>
+              <w:rPr/>
+            </w:pPr>
+            <w:r>
+              <w:rPr>
+                <w:rFonts w:ascii="Times New Roman" w:cs="Times New Roman" w:eastAsia="Times New Roman" w:hAnsi="Times New Roman"/>
+                <w:sz w:val="22"/>
+                <w:szCs w:val="22"/>
+                <w:rtl w:val="0"/>
+              </w:rPr>
+              <w:t xml:space="preserve">$380.000</w:t>
+            </w:r>
+            <w:r>
+              <w:rPr>
+                <w:rtl w:val="0"/>
+              </w:rPr>
+            </w:r>
+          </w:p>
+        </w:tc>
+      </w:tr>
+      <w:tr>
+        <w:trPr>
+          <w:cantSplit w:val="0"/>
+          <w:tblHeader w:val="0"/>
+        </w:trPr>
+        <w:tc>
+          <w:tcPr/>
+          <w:p>
+            <w:pPr>
+              <w:spacing w:after="60" w:before="60" w:line="276" w:lineRule="auto"/>
+              <w:ind w:firstLine="0"/>
+              <w:rPr/>
+            </w:pPr>
+            <w:r>
+              <w:rPr>
+                <w:rFonts w:ascii="Times New Roman" w:cs="Times New Roman" w:eastAsia="Times New Roman" w:hAnsi="Times New Roman"/>
+                <w:sz w:val="22"/>
+                <w:szCs w:val="22"/>
+                <w:rtl w:val="0"/>
+              </w:rPr>
+              <w:t xml:space="preserve">Hospital</w:t>
+            </w:r>
+            <w:r>
+              <w:rPr>
+                <w:rtl w:val="0"/>
+              </w:rPr>
+            </w:r>
+          </w:p>
+        </w:tc>
+        <w:tc>
+          <w:tcPr/>
+          <w:p>
+            <w:pPr>
+              <w:spacing w:after="60" w:before="60" w:line="276" w:lineRule="auto"/>
+              <w:ind w:firstLine="0"/>
+              <w:rPr/>
+            </w:pPr>
+            <w:r>
+              <w:rPr>
+                <w:rFonts w:ascii="Times New Roman" w:cs="Times New Roman" w:eastAsia="Times New Roman" w:hAnsi="Times New Roman"/>
+                <w:sz w:val="22"/>
+                <w:szCs w:val="22"/>
+                <w:rtl w:val="0"/>
+              </w:rPr>
+              <w:t xml:space="preserve">IPS de mediana complejidad</w:t>
+            </w:r>
+            <w:r>
+              <w:rPr>
+                <w:rtl w:val="0"/>
+              </w:rPr>
+            </w:r>
+          </w:p>
+        </w:tc>
+        <w:tc>
+          <w:tcPr/>
+          <w:p>
+            <w:pPr>
+              <w:spacing w:after="60" w:before="60" w:line="276" w:lineRule="auto"/>
+              <w:ind w:firstLine="0"/>
+              <w:rPr/>
+            </w:pPr>
+            <w:r>
+              <w:rPr>
+                <w:rFonts w:ascii="Times New Roman" w:cs="Times New Roman" w:eastAsia="Times New Roman" w:hAnsi="Times New Roman"/>
+                <w:sz w:val="22"/>
+                <w:szCs w:val="22"/>
+                <w:rtl w:val="0"/>
+              </w:rPr>
+              <w:t xml:space="preserve">Hasta 14 usuarios de gestión, 3.000 equipos activos y 100 GB de documentos</w:t>
             </w:r>
             <w:r>
               <w:rPr>

</xml_diff>